<commit_message>
Update sse316 lab report templates
</commit_message>
<xml_diff>
--- a/teaching/sse316/labs/lab4_report.docx
+++ b/teaching/sse316/labs/lab4_report.docx
@@ -183,7 +183,7 @@
           <w:sz w:val="36"/>
           <w:szCs w:val="36"/>
         </w:rPr>
-        <w:t>06</w:t>
+        <w:t>12</w:t>
       </w:r>
       <w:r>
         <w:rPr>
@@ -199,7 +199,7 @@
           <w:sz w:val="36"/>
           <w:szCs w:val="36"/>
         </w:rPr>
-        <w:t>三</w:t>
+        <w:t>二</w:t>
       </w:r>
       <w:r>
         <w:rPr>
@@ -502,7 +502,7 @@
     <w:p>
       <w:pPr>
         <w:rPr>
-          <w:rFonts w:ascii="Microsoft YaHei UI" w:eastAsia="Microsoft YaHei UI" w:hAnsi="Microsoft YaHei UI" w:hint="eastAsia"/>
+          <w:rFonts w:ascii="Microsoft YaHei UI" w:eastAsia="Microsoft YaHei UI" w:hAnsi="Microsoft YaHei UI"/>
         </w:rPr>
       </w:pPr>
     </w:p>
@@ -523,7 +523,7 @@
     <w:p>
       <w:pPr>
         <w:rPr>
-          <w:rFonts w:ascii="Microsoft YaHei UI" w:eastAsia="Microsoft YaHei UI" w:hAnsi="Microsoft YaHei UI" w:hint="eastAsia"/>
+          <w:rFonts w:ascii="Microsoft YaHei UI" w:eastAsia="Microsoft YaHei UI" w:hAnsi="Microsoft YaHei UI"/>
         </w:rPr>
       </w:pPr>
     </w:p>
@@ -632,7 +632,7 @@
     <w:p>
       <w:pPr>
         <w:rPr>
-          <w:rFonts w:ascii="Microsoft YaHei UI" w:eastAsia="Microsoft YaHei UI" w:hAnsi="Microsoft YaHei UI" w:hint="eastAsia"/>
+          <w:rFonts w:ascii="Microsoft YaHei UI" w:eastAsia="Microsoft YaHei UI" w:hAnsi="Microsoft YaHei UI"/>
         </w:rPr>
       </w:pPr>
     </w:p>
@@ -717,7 +717,7 @@
     <w:p>
       <w:pPr>
         <w:rPr>
-          <w:rFonts w:ascii="Microsoft YaHei UI" w:eastAsia="Microsoft YaHei UI" w:hAnsi="Microsoft YaHei UI" w:hint="eastAsia"/>
+          <w:rFonts w:ascii="Microsoft YaHei UI" w:eastAsia="Microsoft YaHei UI" w:hAnsi="Microsoft YaHei UI"/>
         </w:rPr>
       </w:pPr>
     </w:p>

</xml_diff>